<commit_message>
docs: rebuild docx dengan angka tersinkron (token stats 399, oscilasi 0.92-0.96, konvensi test-set)
</commit_message>
<xml_diff>
--- a/paper/Naskah_Metodologi_Hasil_Pembahasan.docx
+++ b/paper/Naskah_Metodologi_Hasil_Pembahasan.docx
@@ -2878,7 +2878,7 @@
           <w:rFonts w:ascii="Times New Roman" w:hAnsi="Times New Roman"/>
           <w:sz w:val="24"/>
         </w:rPr>
-        <w:t>Audit tingkat token memperkuat kebutuhan pra-pemrosesan yang hati-hati. Pada teks latih riil, rata-rata panjang sekuens adalah 34,3 token (median 28; persentil-95 sebesar 75), sehingga batas max_len=120 menyisakan sekitar 71% padding — fakta yang mendasari keputusan masking pada arsitektur. Sebanyak 37,5% kosakata latih riil adalah hapax legomena (muncul sekali), sekalipun hanya mencakup 2,5% kemunculan token; 132 token berupa digit murni (kadar persen dan takaran) memecah kosakata. Temuan ini menjadi dasar eksperimen ablasi pra-pemrosesan, yang menyimpulkan bahwa masking padding membantu, sedangkan pelipatan digit justru menghilangkan sinyal kadar yang diskriminatif.</w:t>
+        <w:t>Audit tingkat token memperkuat kebutuhan pra-pemrosesan yang hati-hati. Pada teks latih riil, rata-rata panjang sekuens adalah 34,8 token (median 28; persentil-95 sebesar 79), sehingga batas max_len=120 menyisakan sekitar 71% padding — fakta yang mendasari keputusan masking pada arsitektur. Sebanyak 36,3% kosakata latih riil adalah hapax legomena (muncul sekali), sekalipun hanya mencakup 2,6% kemunculan token; 128 token berupa digit murni (kadar persen dan takaran) memecah kosakata. Temuan ini menjadi dasar eksperimen ablasi pra-pemrosesan, yang menyimpulkan bahwa masking padding membantu, sedangkan pelipatan digit justru menghilangkan sinyal kadar yang diskriminatif.</w:t>
       </w:r>
     </w:p>
     <w:p>
@@ -3603,7 +3603,7 @@
           <w:rFonts w:ascii="Times New Roman" w:hAnsi="Times New Roman"/>
           <w:sz w:val="24"/>
         </w:rPr>
-        <w:t xml:space="preserve">, fluktuasi kecil kurva validasi (misalnya akurasi validasi berosilasi antara 0,92 dan 0,94) bukanlah overfitting, melainkan kuantisasi sampel kecil: dengan n=50, satu sampel bernilai 2%. </w:t>
+        <w:t xml:space="preserve">, fluktuasi kecil kurva validasi (misalnya akurasi validasi berosilasi antara 0,92 dan 0,96) bukanlah overfitting, melainkan kuantisasi sampel kecil: dengan n=50, satu sampel bernilai 2%. </w:t>
       </w:r>
       <w:r>
         <w:rPr>
@@ -3792,7 +3792,7 @@
           <w:rFonts w:ascii="Times New Roman" w:hAnsi="Times New Roman"/>
           <w:sz w:val="24"/>
         </w:rPr>
-        <w:t>Tabel 4.4 dan 4.5 merangkum kinerja kedua model pada ambang tetap 0,5 beserta interval kepercayaan 95% dari 2.000 ulangan bootstrap terstratifikasi. Pada validasi, IndoBERT unggul di semua metrik (F1 0,980; IK 0,936–1,000; AUC 0,995) atas BiLSTM (F1 0,921; IK 0,840–0,980; AUC 0,977). Pada himpunan beku — ukuran yang bersih dari bias seleksi — IndoBERT mencatat F1 0,899 (IK 0,809–0,980; AUC 0,984), sedangkan BiLSTM mencatat F1 0,842 (IK 0,764–0,926; AUC 0,907).</w:t>
+        <w:t>Tabel 4.4 dan 4.5 merangkum kinerja kedua model pada ambang tetap 0,5 beserta interval kepercayaan 95% dari 2.000 ulangan bootstrap terstratifikasi. Pada validasi, IndoBERT unggul di semua metrik (F1 0,980; IK 0,936–1,000; AUC 0,995) atas BiLSTM (F1 0,920; IK 0,840–0,980; AUC 0,976). Pada himpunan beku — ukuran yang bersih dari bias seleksi — IndoBERT mencatat F1 0,898 (IK 0,809–0,980; AUC 0,984), sedangkan BiLSTM mencatat F1 0,842 (IK 0,764–0,926; AUC 0,907).</w:t>
       </w:r>
     </w:p>
     <w:tbl>
@@ -4040,7 +4040,7 @@
                 <w:rFonts w:ascii="Times New Roman" w:hAnsi="Times New Roman"/>
                 <w:sz w:val="18"/>
               </w:rPr>
-              <w:t>0,921 [0,840–0,980]</w:t>
+              <w:t>0,920 [0,840–0,980]</w:t>
             </w:r>
           </w:p>
         </w:tc>
@@ -4055,7 +4055,7 @@
                 <w:rFonts w:ascii="Times New Roman" w:hAnsi="Times New Roman"/>
                 <w:sz w:val="18"/>
               </w:rPr>
-              <w:t>0,977 [0,930–1,000]</w:t>
+              <w:t>0,976 [0,930–1,000]</w:t>
             </w:r>
           </w:p>
         </w:tc>
@@ -4361,7 +4361,7 @@
                 <w:rFonts w:ascii="Times New Roman" w:hAnsi="Times New Roman"/>
                 <w:sz w:val="18"/>
               </w:rPr>
-              <w:t>0,899 [0,809–0,980]</w:t>
+              <w:t>0,898 [0,809–0,980]</w:t>
             </w:r>
           </w:p>
         </w:tc>
@@ -4644,7 +4644,7 @@
           <w:rFonts w:ascii="Times New Roman" w:hAnsi="Times New Roman"/>
           <w:sz w:val="24"/>
         </w:rPr>
-        <w:t>Perbandingan apel-vs-apel dimungkinkan karena kedua model memakai pool latih, validasi, himpunan beku, dan ambang yang identik. Estimasi titik memihak IndoBERT di hampir semua metrik (misalnya F1 beku 0,899 vs 0,842; AUC 0,984 vs 0,907), kecuali recall himpunan beku yang dimenangkan BiLSTM (0,96 vs 0,88). Namun interval kepercayaan 95% keduanya bertumpang-tindih pada himpunan beku (F1: 0,764–0,926 vs 0,809–0,980), sehingga klaim superioritas statistik memerlukan himpunan uji yang lebih besar — kejujuran ini kami nyatakan eksplisit agar tidak terjadi overklaim. Secara praktis, IndoBERT unggul karena representasi kontekstual dan tokenisasi subword-nya tahan terhadap kosakata jarang dan galat OCR yang melumpuhkan embedding kata-utuh Word2Vec (OOV validasi 3,96%; holdout 5,01%), dengan harga komputasi dan ketergantungan pra-latih yang jauh lebih besar.</w:t>
+        <w:t>Perbandingan apel-vs-apel dimungkinkan karena kedua model memakai pool latih, validasi, himpunan beku, dan ambang yang identik. Estimasi titik memihak IndoBERT di hampir semua metrik (misalnya F1 beku 0,898 vs 0,842; AUC 0,984 vs 0,907), kecuali recall himpunan beku yang dimenangkan BiLSTM (0,96 vs 0,88). Namun interval kepercayaan 95% keduanya bertumpang-tindih pada himpunan beku (F1: 0,764–0,926 vs 0,809–0,980), sehingga klaim superioritas statistik memerlukan himpunan uji yang lebih besar — kejujuran ini kami nyatakan eksplisit agar tidak terjadi overklaim. Secara praktis, IndoBERT unggul karena representasi kontekstual dan tokenisasi subword-nya tahan terhadap kosakata jarang dan galat OCR yang melumpuhkan embedding kata-utuh Word2Vec (OOV validasi 3,96%; holdout 5,01%), dengan harga komputasi dan ketergantungan pra-latih yang jauh lebih besar.</w:t>
       </w:r>
     </w:p>
     <w:tbl>
@@ -4763,7 +4763,7 @@
                 <w:rFonts w:ascii="Times New Roman" w:hAnsi="Times New Roman"/>
                 <w:sz w:val="20"/>
               </w:rPr>
-              <w:t>0,899</w:t>
+              <w:t>0,898</w:t>
             </w:r>
           </w:p>
         </w:tc>

</xml_diff>